<commit_message>
Add subheadings to post tilt up manual
</commit_message>
<xml_diff>
--- a/post-tilt-up/post-tilt-up.docx
+++ b/post-tilt-up/post-tilt-up.docx
@@ -2,13 +2,13 @@
 <file path=word/document.xml><?xml version="1.0" encoding="utf-8"?>
 <w:document xmlns:w="http://schemas.openxmlformats.org/wordprocessingml/2006/main" xmlns:m="http://schemas.openxmlformats.org/officeDocument/2006/math" xmlns:r="http://schemas.openxmlformats.org/officeDocument/2006/relationships" xmlns:o="urn:schemas-microsoft-com:office:office" xmlns:v="urn:schemas-microsoft-com:vml" xmlns:w10="urn:schemas-microsoft-com:office:word" xmlns:a="http://schemas.openxmlformats.org/drawingml/2006/main" xmlns:pic="http://schemas.openxmlformats.org/drawingml/2006/picture" xmlns:wp="http://schemas.openxmlformats.org/drawingml/2006/wordprocessingDrawing">
   <w:body>
-    <w:bookmarkStart w:id="33" w:name="secure-walls-to-platform"/>
+    <w:bookmarkStart w:id="36" w:name="secure-walls-to-platform"/>
     <w:p>
       <w:pPr>
         <w:pStyle w:val="Heading1"/>
       </w:pPr>
       <w:r>
-        <w:t xml:space="preserve">Secure walls to platform</w:t>
+        <w:t xml:space="preserve">Secure Walls to Platform</w:t>
       </w:r>
     </w:p>
     <w:p>
@@ -75,6 +75,15 @@
         <w:br w:type="page"/>
       </w:r>
     </w:p>
+    <w:bookmarkStart w:id="33" w:name="reinforce-corners"/>
+    <w:p>
+      <w:pPr>
+        <w:pStyle w:val="Heading2"/>
+      </w:pPr>
+      <w:r>
+        <w:t xml:space="preserve">Reinforce Corners</w:t>
+      </w:r>
+    </w:p>
     <w:p>
       <w:pPr>
         <w:pStyle w:val="Compact"/>
@@ -84,7 +93,7 @@
         </w:numPr>
       </w:pPr>
       <w:r>
-        <w:t xml:space="preserve">Have one person install 5 #10 x 3” screws in each wall corner, to reinforce these corners</w:t>
+        <w:t xml:space="preserve">Have one person install 5 #10 x 3” screws in each wall corner</w:t>
       </w:r>
     </w:p>
     <w:tbl>
@@ -110,7 +119,7 @@
             <w:r>
               <w:drawing>
                 <wp:inline>
-                  <wp:extent cx="4754880" cy="3361274"/>
+                  <wp:extent cx="4279392" cy="3025147"/>
                   <wp:effectExtent b="0" l="0" r="0" t="0"/>
                   <wp:docPr descr=" " title="" id="24" name="Picture"/>
                   <a:graphic>
@@ -131,7 +140,7 @@
                         <pic:spPr bwMode="auto">
                           <a:xfrm>
                             <a:off x="0" y="0"/>
-                            <a:ext cx="4754880" cy="3361274"/>
+                            <a:ext cx="4279392" cy="3025147"/>
                           </a:xfrm>
                           <a:prstGeom prst="rect">
                             <a:avLst/>
@@ -199,7 +208,7 @@
             <w:r>
               <w:drawing>
                 <wp:inline>
-                  <wp:extent cx="4754880" cy="3361274"/>
+                  <wp:extent cx="4279392" cy="3025147"/>
                   <wp:effectExtent b="0" l="0" r="0" t="0"/>
                   <wp:docPr descr=" " title="" id="29" name="Picture"/>
                   <a:graphic>
@@ -220,7 +229,7 @@
                         <pic:spPr bwMode="auto">
                           <a:xfrm>
                             <a:off x="0" y="0"/>
-                            <a:ext cx="4754880" cy="3361274"/>
+                            <a:ext cx="4279392" cy="3025147"/>
                           </a:xfrm>
                           <a:prstGeom prst="rect">
                             <a:avLst/>
@@ -257,6 +266,16 @@
         </w:tc>
       </w:tr>
     </w:tbl>
+    <w:bookmarkEnd w:id="33"/>
+    <w:bookmarkStart w:id="34" w:name="nail-exterior-to-platform"/>
+    <w:p>
+      <w:pPr>
+        <w:pStyle w:val="Heading2"/>
+      </w:pPr>
+      <w:r>
+        <w:t xml:space="preserve">Nail Exterior to Platform</w:t>
+      </w:r>
+    </w:p>
     <w:p>
       <w:pPr>
         <w:pStyle w:val="Compact"/>
@@ -293,12 +312,22 @@
         <w:t xml:space="preserve">Verify that the exterior paneling is nailed to the frame around the top and sides of the front door. If not, nail that at this stage (every 8”).</w:t>
       </w:r>
     </w:p>
-    <w:p>
-      <w:pPr>
-        <w:pStyle w:val="Compact"/>
-        <w:numPr>
-          <w:ilvl w:val="0"/>
-          <w:numId w:val="1003"/>
+    <w:bookmarkEnd w:id="34"/>
+    <w:bookmarkStart w:id="35" w:name="prep-interior"/>
+    <w:p>
+      <w:pPr>
+        <w:pStyle w:val="Heading2"/>
+      </w:pPr>
+      <w:r>
+        <w:t xml:space="preserve">Prep Interior</w:t>
+      </w:r>
+    </w:p>
+    <w:p>
+      <w:pPr>
+        <w:pStyle w:val="Compact"/>
+        <w:numPr>
+          <w:ilvl w:val="0"/>
+          <w:numId w:val="1004"/>
         </w:numPr>
       </w:pPr>
       <w:r>
@@ -310,7 +339,7 @@
         <w:pStyle w:val="Compact"/>
         <w:numPr>
           <w:ilvl w:val="0"/>
-          <w:numId w:val="1003"/>
+          <w:numId w:val="1004"/>
         </w:numPr>
       </w:pPr>
       <w:r>
@@ -334,7 +363,7 @@
         <w:pStyle w:val="Compact"/>
         <w:numPr>
           <w:ilvl w:val="0"/>
-          <w:numId w:val="1003"/>
+          <w:numId w:val="1004"/>
         </w:numPr>
       </w:pPr>
       <w:r>
@@ -346,7 +375,7 @@
         <w:pStyle w:val="Compact"/>
         <w:numPr>
           <w:ilvl w:val="0"/>
-          <w:numId w:val="1003"/>
+          <w:numId w:val="1004"/>
         </w:numPr>
       </w:pPr>
       <w:r>
@@ -358,22 +387,32 @@
         <w:br w:type="page"/>
       </w:r>
     </w:p>
-    <w:bookmarkEnd w:id="33"/>
-    <w:bookmarkStart w:id="49" w:name="install-structural-triangles"/>
+    <w:bookmarkEnd w:id="35"/>
+    <w:bookmarkEnd w:id="36"/>
+    <w:bookmarkStart w:id="56" w:name="install-structural-triangles"/>
     <w:p>
       <w:pPr>
         <w:pStyle w:val="Heading1"/>
       </w:pPr>
       <w:r>
-        <w:t xml:space="preserve">Install structural triangles</w:t>
-      </w:r>
-    </w:p>
-    <w:p>
-      <w:pPr>
-        <w:pStyle w:val="Compact"/>
-        <w:numPr>
-          <w:ilvl w:val="0"/>
-          <w:numId w:val="1004"/>
+        <w:t xml:space="preserve">Install Structural Triangles</w:t>
+      </w:r>
+    </w:p>
+    <w:bookmarkStart w:id="40" w:name="setup"/>
+    <w:p>
+      <w:pPr>
+        <w:pStyle w:val="Heading2"/>
+      </w:pPr>
+      <w:r>
+        <w:t xml:space="preserve">Setup</w:t>
+      </w:r>
+    </w:p>
+    <w:p>
+      <w:pPr>
+        <w:pStyle w:val="Compact"/>
+        <w:numPr>
+          <w:ilvl w:val="0"/>
+          <w:numId w:val="1005"/>
         </w:numPr>
       </w:pPr>
       <w:r>
@@ -385,75 +424,11 @@
         <w:pStyle w:val="Compact"/>
         <w:numPr>
           <w:ilvl w:val="0"/>
-          <w:numId w:val="1004"/>
+          <w:numId w:val="1005"/>
         </w:numPr>
       </w:pPr>
       <w:r>
         <w:t xml:space="preserve">Preset brown #10x3” screws in each of two structural triangles, as shown in the diagram a couple of pages on from here. In the two center bays, there are four screws, angled enough that you could drive them in with an impact driver. In the two outer bays, there are two screws angled in from one side of the triangle, starting about ¾” in from the edge of the bottom plate. Then there are two screws driven in vertically about 1” toward the center from the seam between the bottom plate and the angled side of the triangle.</w:t>
-      </w:r>
-    </w:p>
-    <w:p>
-      <w:pPr>
-        <w:pStyle w:val="FirstParagraph"/>
-      </w:pPr>
-      <w:r>
-        <w:drawing>
-          <wp:inline>
-            <wp:extent cx="5943600" cy="4201593"/>
-            <wp:effectExtent b="0" l="0" r="0" t="0"/>
-            <wp:docPr descr="" title="" id="35" name="Picture"/>
-            <a:graphic>
-              <a:graphicData uri="http://schemas.openxmlformats.org/drawingml/2006/picture">
-                <pic:pic>
-                  <pic:nvPicPr>
-                    <pic:cNvPr descr="images/image_34.png" id="36" name="Picture"/>
-                    <pic:cNvPicPr>
-                      <a:picLocks noChangeArrowheads="1" noChangeAspect="1"/>
-                    </pic:cNvPicPr>
-                  </pic:nvPicPr>
-                  <pic:blipFill>
-                    <a:blip r:embed="rId34"/>
-                    <a:stretch>
-                      <a:fillRect/>
-                    </a:stretch>
-                  </pic:blipFill>
-                  <pic:spPr bwMode="auto">
-                    <a:xfrm>
-                      <a:off x="0" y="0"/>
-                      <a:ext cx="5943600" cy="4201593"/>
-                    </a:xfrm>
-                    <a:prstGeom prst="rect">
-                      <a:avLst/>
-                    </a:prstGeom>
-                    <a:noFill/>
-                    <a:ln w="9525">
-                      <a:noFill/>
-                      <a:headEnd/>
-                      <a:tailEnd/>
-                    </a:ln>
-                  </pic:spPr>
-                </pic:pic>
-              </a:graphicData>
-            </a:graphic>
-          </wp:inline>
-        </w:drawing>
-      </w:r>
-    </w:p>
-    <w:p>
-      <w:r>
-        <w:br w:type="page"/>
-      </w:r>
-    </w:p>
-    <w:p>
-      <w:pPr>
-        <w:pStyle w:val="Compact"/>
-        <w:numPr>
-          <w:ilvl w:val="0"/>
-          <w:numId w:val="1005"/>
-        </w:numPr>
-      </w:pPr>
-      <w:r>
-        <w:t xml:space="preserve">Position a triangle on the front wall, and, with a helper inside the home, center it from side to side.</w:t>
       </w:r>
     </w:p>
     <w:p>
@@ -470,7 +445,7 @@
               <a:graphicData uri="http://schemas.openxmlformats.org/drawingml/2006/picture">
                 <pic:pic>
                   <pic:nvPicPr>
-                    <pic:cNvPr descr="images/image_36.png" id="39" name="Picture"/>
+                    <pic:cNvPr descr="images/image_34.png" id="39" name="Picture"/>
                     <pic:cNvPicPr>
                       <a:picLocks noChangeArrowheads="1" noChangeAspect="1"/>
                     </pic:cNvPicPr>
@@ -508,6 +483,16 @@
         <w:br w:type="page"/>
       </w:r>
     </w:p>
+    <w:bookmarkEnd w:id="40"/>
+    <w:bookmarkStart w:id="47" w:name="align-triangle"/>
+    <w:p>
+      <w:pPr>
+        <w:pStyle w:val="Heading2"/>
+      </w:pPr>
+      <w:r>
+        <w:t xml:space="preserve">Align Triangle</w:t>
+      </w:r>
+    </w:p>
     <w:p>
       <w:pPr>
         <w:pStyle w:val="Compact"/>
@@ -517,19 +502,7 @@
         </w:numPr>
       </w:pPr>
       <w:r>
-        <w:t xml:space="preserve">Verify that the bottom plate of the triangle is flush with the inside wall framing all the way across the front wall.</w:t>
-      </w:r>
-    </w:p>
-    <w:p>
-      <w:pPr>
-        <w:pStyle w:val="Compact"/>
-        <w:numPr>
-          <w:ilvl w:val="0"/>
-          <w:numId w:val="1006"/>
-        </w:numPr>
-      </w:pPr>
-      <w:r>
-        <w:t xml:space="preserve">Clamp the triangle to the wall top plate (or door opening) about 6” from each end.</w:t>
+        <w:t xml:space="preserve">Position a triangle on the front wall, and, with a helper inside the home, center it from side to side.</w:t>
       </w:r>
     </w:p>
     <w:p>
@@ -541,18 +514,18 @@
           <wp:inline>
             <wp:extent cx="5943600" cy="4201593"/>
             <wp:effectExtent b="0" l="0" r="0" t="0"/>
-            <wp:docPr descr="" title="" id="41" name="Picture"/>
+            <wp:docPr descr="" title="" id="42" name="Picture"/>
             <a:graphic>
               <a:graphicData uri="http://schemas.openxmlformats.org/drawingml/2006/picture">
                 <pic:pic>
                   <pic:nvPicPr>
-                    <pic:cNvPr descr="images/image_35.png" id="42" name="Picture"/>
+                    <pic:cNvPr descr="images/image_36.png" id="43" name="Picture"/>
                     <pic:cNvPicPr>
                       <a:picLocks noChangeArrowheads="1" noChangeAspect="1"/>
                     </pic:cNvPicPr>
                   </pic:nvPicPr>
                   <pic:blipFill>
-                    <a:blip r:embed="rId40"/>
+                    <a:blip r:embed="rId41"/>
                     <a:stretch>
                       <a:fillRect/>
                     </a:stretch>
@@ -593,7 +566,7 @@
         </w:numPr>
       </w:pPr>
       <w:r>
-        <w:t xml:space="preserve">From the ladder, drive all the preset screws into the wall framing to secure the triangle.</w:t>
+        <w:t xml:space="preserve">Verify that the bottom plate of the triangle is flush with the inside wall framing all the way across the front wall.</w:t>
       </w:r>
     </w:p>
     <w:p>
@@ -605,7 +578,7 @@
         </w:numPr>
       </w:pPr>
       <w:r>
-        <w:t xml:space="preserve">Repeat these last three steps on the rear wall.</w:t>
+        <w:t xml:space="preserve">Clamp the triangle to the wall top plate (or door opening) about 6” from each end.</w:t>
       </w:r>
     </w:p>
     <w:p>
@@ -617,18 +590,18 @@
           <wp:inline>
             <wp:extent cx="5943600" cy="4201593"/>
             <wp:effectExtent b="0" l="0" r="0" t="0"/>
-            <wp:docPr descr="" title="" id="44" name="Picture"/>
+            <wp:docPr descr="" title="" id="45" name="Picture"/>
             <a:graphic>
               <a:graphicData uri="http://schemas.openxmlformats.org/drawingml/2006/picture">
                 <pic:pic>
                   <pic:nvPicPr>
-                    <pic:cNvPr descr="images/image_37.png" id="45" name="Picture"/>
+                    <pic:cNvPr descr="images/image_35.png" id="46" name="Picture"/>
                     <pic:cNvPicPr>
                       <a:picLocks noChangeArrowheads="1" noChangeAspect="1"/>
                     </pic:cNvPicPr>
                   </pic:nvPicPr>
                   <pic:blipFill>
-                    <a:blip r:embed="rId43"/>
+                    <a:blip r:embed="rId44"/>
                     <a:stretch>
                       <a:fillRect/>
                     </a:stretch>
@@ -660,35 +633,61 @@
         <w:br w:type="page"/>
       </w:r>
     </w:p>
-    <w:p>
-      <w:pPr>
-        <w:pStyle w:val="BodyText"/>
-      </w:pPr>
-      <w:r>
-        <w:t xml:space="preserve">While these tasks are being completed, have two crew members position a half-roof assembly against each of the side walls, with the 1x8 white board at the bottom and facing away from the wall. Check that there is a pencil line drawn at 6 ¼” from the front of the 1x6 board (the top of the half roof) all the way down and across what will be the bottom of the half roof when it is installed</w:t>
-      </w:r>
-    </w:p>
-    <w:p>
-      <w:pPr>
-        <w:pStyle w:val="BodyText"/>
+    <w:bookmarkEnd w:id="47"/>
+    <w:bookmarkStart w:id="51" w:name="attach-triangles"/>
+    <w:p>
+      <w:pPr>
+        <w:pStyle w:val="Heading2"/>
+      </w:pPr>
+      <w:r>
+        <w:t xml:space="preserve">Attach Triangles</w:t>
+      </w:r>
+    </w:p>
+    <w:p>
+      <w:pPr>
+        <w:pStyle w:val="Compact"/>
+        <w:numPr>
+          <w:ilvl w:val="0"/>
+          <w:numId w:val="1008"/>
+        </w:numPr>
+      </w:pPr>
+      <w:r>
+        <w:t xml:space="preserve">From the ladder, drive all the preset screws into the wall framing to secure the triangle.</w:t>
+      </w:r>
+    </w:p>
+    <w:p>
+      <w:pPr>
+        <w:pStyle w:val="Compact"/>
+        <w:numPr>
+          <w:ilvl w:val="0"/>
+          <w:numId w:val="1008"/>
+        </w:numPr>
+      </w:pPr>
+      <w:r>
+        <w:t xml:space="preserve">Repeat these last three steps on the rear wall.</w:t>
+      </w:r>
+    </w:p>
+    <w:p>
+      <w:pPr>
+        <w:pStyle w:val="FirstParagraph"/>
       </w:pPr>
       <w:r>
         <w:drawing>
           <wp:inline>
             <wp:extent cx="5943600" cy="4201593"/>
             <wp:effectExtent b="0" l="0" r="0" t="0"/>
-            <wp:docPr descr="" title="" id="47" name="Picture"/>
+            <wp:docPr descr="" title="" id="49" name="Picture"/>
             <a:graphic>
               <a:graphicData uri="http://schemas.openxmlformats.org/drawingml/2006/picture">
                 <pic:pic>
                   <pic:nvPicPr>
-                    <pic:cNvPr descr="images/image_38.png" id="48" name="Picture"/>
+                    <pic:cNvPr descr="images/image_37.png" id="50" name="Picture"/>
                     <pic:cNvPicPr>
                       <a:picLocks noChangeArrowheads="1" noChangeAspect="1"/>
                     </pic:cNvPicPr>
                   </pic:nvPicPr>
                   <pic:blipFill>
-                    <a:blip r:embed="rId46"/>
+                    <a:blip r:embed="rId48"/>
                     <a:stretch>
                       <a:fillRect/>
                     </a:stretch>
@@ -720,22 +719,93 @@
         <w:br w:type="page"/>
       </w:r>
     </w:p>
-    <w:bookmarkEnd w:id="49"/>
-    <w:bookmarkStart w:id="87" w:name="raise-half-roofs"/>
+    <w:bookmarkEnd w:id="51"/>
+    <w:bookmarkStart w:id="55" w:name="prepare-for-half-roof-installation"/>
+    <w:p>
+      <w:pPr>
+        <w:pStyle w:val="Heading2"/>
+      </w:pPr>
+      <w:r>
+        <w:t xml:space="preserve">Prepare for Half-Roof Installation</w:t>
+      </w:r>
+    </w:p>
+    <w:p>
+      <w:pPr>
+        <w:pStyle w:val="FirstParagraph"/>
+      </w:pPr>
+      <w:r>
+        <w:t xml:space="preserve">While these tasks are being completed, have two crew members position a half-roof assembly against each of the side walls, with the 1x8 white board at the bottom and facing away from the wall. Check that there is a pencil line drawn at 6 ¼” from the front of the 1x6 board (the top of the half roof) all the way down and across what will be the bottom of the half roof when it is installed</w:t>
+      </w:r>
+    </w:p>
+    <w:p>
+      <w:pPr>
+        <w:pStyle w:val="BodyText"/>
+      </w:pPr>
+      <w:r>
+        <w:drawing>
+          <wp:inline>
+            <wp:extent cx="5943600" cy="4201593"/>
+            <wp:effectExtent b="0" l="0" r="0" t="0"/>
+            <wp:docPr descr="" title="" id="53" name="Picture"/>
+            <a:graphic>
+              <a:graphicData uri="http://schemas.openxmlformats.org/drawingml/2006/picture">
+                <pic:pic>
+                  <pic:nvPicPr>
+                    <pic:cNvPr descr="images/image_38.png" id="54" name="Picture"/>
+                    <pic:cNvPicPr>
+                      <a:picLocks noChangeArrowheads="1" noChangeAspect="1"/>
+                    </pic:cNvPicPr>
+                  </pic:nvPicPr>
+                  <pic:blipFill>
+                    <a:blip r:embed="rId52"/>
+                    <a:stretch>
+                      <a:fillRect/>
+                    </a:stretch>
+                  </pic:blipFill>
+                  <pic:spPr bwMode="auto">
+                    <a:xfrm>
+                      <a:off x="0" y="0"/>
+                      <a:ext cx="5943600" cy="4201593"/>
+                    </a:xfrm>
+                    <a:prstGeom prst="rect">
+                      <a:avLst/>
+                    </a:prstGeom>
+                    <a:noFill/>
+                    <a:ln w="9525">
+                      <a:noFill/>
+                      <a:headEnd/>
+                      <a:tailEnd/>
+                    </a:ln>
+                  </pic:spPr>
+                </pic:pic>
+              </a:graphicData>
+            </a:graphic>
+          </wp:inline>
+        </w:drawing>
+      </w:r>
+    </w:p>
+    <w:p>
+      <w:r>
+        <w:br w:type="page"/>
+      </w:r>
+    </w:p>
+    <w:bookmarkEnd w:id="55"/>
+    <w:bookmarkEnd w:id="56"/>
+    <w:bookmarkStart w:id="104" w:name="raise-half-roofs"/>
     <w:p>
       <w:pPr>
         <w:pStyle w:val="Heading1"/>
       </w:pPr>
       <w:r>
-        <w:t xml:space="preserve">Raise half-roofs</w:t>
-      </w:r>
-    </w:p>
-    <w:p>
-      <w:pPr>
-        <w:pStyle w:val="Compact"/>
-        <w:numPr>
-          <w:ilvl w:val="0"/>
-          <w:numId w:val="1008"/>
+        <w:t xml:space="preserve">Raise Half-Roofs</w:t>
+      </w:r>
+    </w:p>
+    <w:p>
+      <w:pPr>
+        <w:pStyle w:val="Compact"/>
+        <w:numPr>
+          <w:ilvl w:val="0"/>
+          <w:numId w:val="1009"/>
         </w:numPr>
       </w:pPr>
       <w:r>
@@ -747,7 +817,7 @@
         <w:pStyle w:val="Compact"/>
         <w:numPr>
           <w:ilvl w:val="0"/>
-          <w:numId w:val="1008"/>
+          <w:numId w:val="1009"/>
         </w:numPr>
       </w:pPr>
       <w:r>
@@ -759,7 +829,7 @@
         <w:pStyle w:val="Compact"/>
         <w:numPr>
           <w:ilvl w:val="0"/>
-          <w:numId w:val="1008"/>
+          <w:numId w:val="1009"/>
         </w:numPr>
       </w:pPr>
       <w:r>
@@ -771,7 +841,7 @@
         <w:pStyle w:val="Compact"/>
         <w:numPr>
           <w:ilvl w:val="0"/>
-          <w:numId w:val="1008"/>
+          <w:numId w:val="1009"/>
         </w:numPr>
       </w:pPr>
       <w:r>
@@ -783,7 +853,7 @@
         <w:pStyle w:val="Compact"/>
         <w:numPr>
           <w:ilvl w:val="0"/>
-          <w:numId w:val="1008"/>
+          <w:numId w:val="1009"/>
         </w:numPr>
       </w:pPr>
       <w:r>
@@ -795,7 +865,7 @@
         <w:pStyle w:val="Compact"/>
         <w:numPr>
           <w:ilvl w:val="0"/>
-          <w:numId w:val="1008"/>
+          <w:numId w:val="1009"/>
         </w:numPr>
       </w:pPr>
       <w:r>
@@ -815,30 +885,30 @@
       <w:tr>
         <w:tc>
           <w:tcPr/>
-          <w:bookmarkStart w:id="54" w:name="fig-539a35d47e664c97a50115a146a7f1bd-3"/>
+          <w:bookmarkStart w:id="61" w:name="fig-539a35d47e664c97a50115a146a7f1bd-3"/>
           <w:p>
             <w:pPr>
               <w:pStyle w:val="Compact"/>
               <w:jc w:val="center"/>
             </w:pPr>
-            <w:bookmarkStart w:id="53" w:name="fig-539a35d47e664c97a50115a146a7f1bd-3"/>
+            <w:bookmarkStart w:id="60" w:name="fig-539a35d47e664c97a50115a146a7f1bd-3"/>
             <w:r>
               <w:drawing>
                 <wp:inline>
                   <wp:extent cx="4754880" cy="3361274"/>
                   <wp:effectExtent b="0" l="0" r="0" t="0"/>
-                  <wp:docPr descr=" " title="" id="51" name="Picture"/>
+                  <wp:docPr descr=" " title="" id="58" name="Picture"/>
                   <a:graphic>
                     <a:graphicData uri="http://schemas.openxmlformats.org/drawingml/2006/picture">
                       <pic:pic>
                         <pic:nvPicPr>
-                          <pic:cNvPr descr="images/image_39.png" id="52" name="Picture"/>
+                          <pic:cNvPr descr="images/image_39.png" id="59" name="Picture"/>
                           <pic:cNvPicPr>
                             <a:picLocks noChangeArrowheads="1" noChangeAspect="1"/>
                           </pic:cNvPicPr>
                         </pic:nvPicPr>
                         <pic:blipFill>
-                          <a:blip r:embed="rId50"/>
+                          <a:blip r:embed="rId57"/>
                           <a:stretch>
                             <a:fillRect/>
                           </a:stretch>
@@ -864,7 +934,7 @@
                 </wp:inline>
               </w:drawing>
             </w:r>
-            <w:bookmarkEnd w:id="53"/>
+            <w:bookmarkEnd w:id="60"/>
           </w:p>
           <w:p>
             <w:pPr>
@@ -879,7 +949,7 @@
               <w:t xml:space="preserve"> </w:t>
             </w:r>
           </w:p>
-          <w:bookmarkEnd w:id="54"/>
+          <w:bookmarkEnd w:id="61"/>
         </w:tc>
       </w:tr>
     </w:tbl>
@@ -904,30 +974,30 @@
       <w:tr>
         <w:tc>
           <w:tcPr/>
-          <w:bookmarkStart w:id="59" w:name="fig-539a35d47e664c97a50115a146a7f1bd-4"/>
+          <w:bookmarkStart w:id="66" w:name="fig-539a35d47e664c97a50115a146a7f1bd-4"/>
           <w:p>
             <w:pPr>
               <w:pStyle w:val="Compact"/>
               <w:jc w:val="center"/>
             </w:pPr>
-            <w:bookmarkStart w:id="58" w:name="fig-539a35d47e664c97a50115a146a7f1bd-4"/>
+            <w:bookmarkStart w:id="65" w:name="fig-539a35d47e664c97a50115a146a7f1bd-4"/>
             <w:r>
               <w:drawing>
                 <wp:inline>
                   <wp:extent cx="4754880" cy="3361274"/>
                   <wp:effectExtent b="0" l="0" r="0" t="0"/>
-                  <wp:docPr descr=" " title="" id="56" name="Picture"/>
+                  <wp:docPr descr=" " title="" id="63" name="Picture"/>
                   <a:graphic>
                     <a:graphicData uri="http://schemas.openxmlformats.org/drawingml/2006/picture">
                       <pic:pic>
                         <pic:nvPicPr>
-                          <pic:cNvPr descr="images/image_40.png" id="57" name="Picture"/>
+                          <pic:cNvPr descr="images/image_40.png" id="64" name="Picture"/>
                           <pic:cNvPicPr>
                             <a:picLocks noChangeArrowheads="1" noChangeAspect="1"/>
                           </pic:cNvPicPr>
                         </pic:nvPicPr>
                         <pic:blipFill>
-                          <a:blip r:embed="rId55"/>
+                          <a:blip r:embed="rId62"/>
                           <a:stretch>
                             <a:fillRect/>
                           </a:stretch>
@@ -953,7 +1023,7 @@
                 </wp:inline>
               </w:drawing>
             </w:r>
-            <w:bookmarkEnd w:id="58"/>
+            <w:bookmarkEnd w:id="65"/>
           </w:p>
           <w:p>
             <w:pPr>
@@ -968,7 +1038,7 @@
               <w:t xml:space="preserve"> </w:t>
             </w:r>
           </w:p>
-          <w:bookmarkEnd w:id="59"/>
+          <w:bookmarkEnd w:id="66"/>
         </w:tc>
       </w:tr>
     </w:tbl>
@@ -993,30 +1063,30 @@
       <w:tr>
         <w:tc>
           <w:tcPr/>
-          <w:bookmarkStart w:id="64" w:name="fig-539a35d47e664c97a50115a146a7f1bd-5"/>
+          <w:bookmarkStart w:id="71" w:name="fig-539a35d47e664c97a50115a146a7f1bd-5"/>
           <w:p>
             <w:pPr>
               <w:pStyle w:val="Compact"/>
               <w:jc w:val="center"/>
             </w:pPr>
-            <w:bookmarkStart w:id="63" w:name="fig-539a35d47e664c97a50115a146a7f1bd-5"/>
+            <w:bookmarkStart w:id="70" w:name="fig-539a35d47e664c97a50115a146a7f1bd-5"/>
             <w:r>
               <w:drawing>
                 <wp:inline>
                   <wp:extent cx="4754880" cy="3361274"/>
                   <wp:effectExtent b="0" l="0" r="0" t="0"/>
-                  <wp:docPr descr=" " title="" id="61" name="Picture"/>
+                  <wp:docPr descr=" " title="" id="68" name="Picture"/>
                   <a:graphic>
                     <a:graphicData uri="http://schemas.openxmlformats.org/drawingml/2006/picture">
                       <pic:pic>
                         <pic:nvPicPr>
-                          <pic:cNvPr descr="images/image_41.png" id="62" name="Picture"/>
+                          <pic:cNvPr descr="images/image_41.png" id="69" name="Picture"/>
                           <pic:cNvPicPr>
                             <a:picLocks noChangeArrowheads="1" noChangeAspect="1"/>
                           </pic:cNvPicPr>
                         </pic:nvPicPr>
                         <pic:blipFill>
-                          <a:blip r:embed="rId60"/>
+                          <a:blip r:embed="rId67"/>
                           <a:stretch>
                             <a:fillRect/>
                           </a:stretch>
@@ -1042,7 +1112,7 @@
                 </wp:inline>
               </w:drawing>
             </w:r>
-            <w:bookmarkEnd w:id="63"/>
+            <w:bookmarkEnd w:id="70"/>
           </w:p>
           <w:p>
             <w:pPr>
@@ -1057,7 +1127,7 @@
               <w:t xml:space="preserve"> </w:t>
             </w:r>
           </w:p>
-          <w:bookmarkEnd w:id="64"/>
+          <w:bookmarkEnd w:id="71"/>
         </w:tc>
       </w:tr>
     </w:tbl>
@@ -1066,12 +1136,21 @@
         <w:br w:type="page"/>
       </w:r>
     </w:p>
-    <w:p>
-      <w:pPr>
-        <w:pStyle w:val="Compact"/>
-        <w:numPr>
-          <w:ilvl w:val="0"/>
-          <w:numId w:val="1009"/>
+    <w:bookmarkStart w:id="75" w:name="align-first-half-roof"/>
+    <w:p>
+      <w:pPr>
+        <w:pStyle w:val="Heading2"/>
+      </w:pPr>
+      <w:r>
+        <w:t xml:space="preserve">Align First Half-Roof</w:t>
+      </w:r>
+    </w:p>
+    <w:p>
+      <w:pPr>
+        <w:pStyle w:val="Compact"/>
+        <w:numPr>
+          <w:ilvl w:val="0"/>
+          <w:numId w:val="1010"/>
         </w:numPr>
       </w:pPr>
       <w:r>
@@ -1083,7 +1162,7 @@
         <w:pStyle w:val="Compact"/>
         <w:numPr>
           <w:ilvl w:val="0"/>
-          <w:numId w:val="1009"/>
+          <w:numId w:val="1010"/>
         </w:numPr>
       </w:pPr>
       <w:r>
@@ -1099,18 +1178,18 @@
           <wp:inline>
             <wp:extent cx="5943600" cy="4201593"/>
             <wp:effectExtent b="0" l="0" r="0" t="0"/>
-            <wp:docPr descr="" title="" id="66" name="Picture"/>
+            <wp:docPr descr="" title="" id="73" name="Picture"/>
             <a:graphic>
               <a:graphicData uri="http://schemas.openxmlformats.org/drawingml/2006/picture">
                 <pic:pic>
                   <pic:nvPicPr>
-                    <pic:cNvPr descr="images/image_42.png" id="67" name="Picture"/>
+                    <pic:cNvPr descr="images/image_42.png" id="74" name="Picture"/>
                     <pic:cNvPicPr>
                       <a:picLocks noChangeArrowheads="1" noChangeAspect="1"/>
                     </pic:cNvPicPr>
                   </pic:nvPicPr>
                   <pic:blipFill>
-                    <a:blip r:embed="rId65"/>
+                    <a:blip r:embed="rId72"/>
                     <a:stretch>
                       <a:fillRect/>
                     </a:stretch>
@@ -1142,12 +1221,22 @@
         <w:br w:type="page"/>
       </w:r>
     </w:p>
-    <w:p>
-      <w:pPr>
-        <w:pStyle w:val="Compact"/>
-        <w:numPr>
-          <w:ilvl w:val="0"/>
-          <w:numId w:val="1010"/>
+    <w:bookmarkEnd w:id="75"/>
+    <w:bookmarkStart w:id="89" w:name="raise-second-half-roof"/>
+    <w:p>
+      <w:pPr>
+        <w:pStyle w:val="Heading2"/>
+      </w:pPr>
+      <w:r>
+        <w:t xml:space="preserve">Raise Second Half-Roof</w:t>
+      </w:r>
+    </w:p>
+    <w:p>
+      <w:pPr>
+        <w:pStyle w:val="Compact"/>
+        <w:numPr>
+          <w:ilvl w:val="0"/>
+          <w:numId w:val="1011"/>
         </w:numPr>
       </w:pPr>
       <w:r>
@@ -1159,7 +1248,7 @@
         <w:pStyle w:val="Compact"/>
         <w:numPr>
           <w:ilvl w:val="0"/>
-          <w:numId w:val="1010"/>
+          <w:numId w:val="1011"/>
         </w:numPr>
       </w:pPr>
       <w:r>
@@ -1175,18 +1264,18 @@
           <wp:inline>
             <wp:extent cx="5943600" cy="4201593"/>
             <wp:effectExtent b="0" l="0" r="0" t="0"/>
-            <wp:docPr descr="" title="" id="69" name="Picture"/>
+            <wp:docPr descr="" title="" id="77" name="Picture"/>
             <a:graphic>
               <a:graphicData uri="http://schemas.openxmlformats.org/drawingml/2006/picture">
                 <pic:pic>
                   <pic:nvPicPr>
-                    <pic:cNvPr descr="images/image_43.png" id="70" name="Picture"/>
+                    <pic:cNvPr descr="images/image_43.png" id="78" name="Picture"/>
                     <pic:cNvPicPr>
                       <a:picLocks noChangeArrowheads="1" noChangeAspect="1"/>
                     </pic:cNvPicPr>
                   </pic:nvPicPr>
                   <pic:blipFill>
-                    <a:blip r:embed="rId68"/>
+                    <a:blip r:embed="rId76"/>
                     <a:stretch>
                       <a:fillRect/>
                     </a:stretch>
@@ -1226,30 +1315,30 @@
       <w:tr>
         <w:tc>
           <w:tcPr/>
-          <w:bookmarkStart w:id="75" w:name="fig-539a35d47e664c97a50115a146a7f1bd-6"/>
+          <w:bookmarkStart w:id="83" w:name="fig-539a35d47e664c97a50115a146a7f1bd-6"/>
           <w:p>
             <w:pPr>
               <w:pStyle w:val="Compact"/>
               <w:jc w:val="center"/>
             </w:pPr>
-            <w:bookmarkStart w:id="74" w:name="fig-539a35d47e664c97a50115a146a7f1bd-6"/>
+            <w:bookmarkStart w:id="82" w:name="fig-539a35d47e664c97a50115a146a7f1bd-6"/>
             <w:r>
               <w:drawing>
                 <wp:inline>
                   <wp:extent cx="4754880" cy="3361274"/>
                   <wp:effectExtent b="0" l="0" r="0" t="0"/>
-                  <wp:docPr descr=" " title="" id="72" name="Picture"/>
+                  <wp:docPr descr=" " title="" id="80" name="Picture"/>
                   <a:graphic>
                     <a:graphicData uri="http://schemas.openxmlformats.org/drawingml/2006/picture">
                       <pic:pic>
                         <pic:nvPicPr>
-                          <pic:cNvPr descr="images/image_45.png" id="73" name="Picture"/>
+                          <pic:cNvPr descr="images/image_45.png" id="81" name="Picture"/>
                           <pic:cNvPicPr>
                             <a:picLocks noChangeArrowheads="1" noChangeAspect="1"/>
                           </pic:cNvPicPr>
                         </pic:nvPicPr>
                         <pic:blipFill>
-                          <a:blip r:embed="rId71"/>
+                          <a:blip r:embed="rId79"/>
                           <a:stretch>
                             <a:fillRect/>
                           </a:stretch>
@@ -1275,7 +1364,7 @@
                 </wp:inline>
               </w:drawing>
             </w:r>
-            <w:bookmarkEnd w:id="74"/>
+            <w:bookmarkEnd w:id="82"/>
           </w:p>
           <w:p>
             <w:pPr>
@@ -1290,7 +1379,7 @@
               <w:t xml:space="preserve"> </w:t>
             </w:r>
           </w:p>
-          <w:bookmarkEnd w:id="75"/>
+          <w:bookmarkEnd w:id="83"/>
         </w:tc>
       </w:tr>
     </w:tbl>
@@ -1315,30 +1404,30 @@
       <w:tr>
         <w:tc>
           <w:tcPr/>
-          <w:bookmarkStart w:id="80" w:name="fig-539a35d47e664c97a50115a146a7f1bd-7"/>
+          <w:bookmarkStart w:id="88" w:name="fig-539a35d47e664c97a50115a146a7f1bd-7"/>
           <w:p>
             <w:pPr>
               <w:pStyle w:val="Compact"/>
               <w:jc w:val="center"/>
             </w:pPr>
-            <w:bookmarkStart w:id="79" w:name="fig-539a35d47e664c97a50115a146a7f1bd-7"/>
+            <w:bookmarkStart w:id="87" w:name="fig-539a35d47e664c97a50115a146a7f1bd-7"/>
             <w:r>
               <w:drawing>
                 <wp:inline>
                   <wp:extent cx="4754880" cy="3361274"/>
                   <wp:effectExtent b="0" l="0" r="0" t="0"/>
-                  <wp:docPr descr=" " title="" id="77" name="Picture"/>
+                  <wp:docPr descr=" " title="" id="85" name="Picture"/>
                   <a:graphic>
                     <a:graphicData uri="http://schemas.openxmlformats.org/drawingml/2006/picture">
                       <pic:pic>
                         <pic:nvPicPr>
-                          <pic:cNvPr descr="images/image_46.png" id="78" name="Picture"/>
+                          <pic:cNvPr descr="images/image_46.png" id="86" name="Picture"/>
                           <pic:cNvPicPr>
                             <a:picLocks noChangeArrowheads="1" noChangeAspect="1"/>
                           </pic:cNvPicPr>
                         </pic:nvPicPr>
                         <pic:blipFill>
-                          <a:blip r:embed="rId76"/>
+                          <a:blip r:embed="rId84"/>
                           <a:stretch>
                             <a:fillRect/>
                           </a:stretch>
@@ -1364,7 +1453,7 @@
                 </wp:inline>
               </w:drawing>
             </w:r>
-            <w:bookmarkEnd w:id="79"/>
+            <w:bookmarkEnd w:id="87"/>
           </w:p>
           <w:p>
             <w:pPr>
@@ -1379,7 +1468,7 @@
               <w:t xml:space="preserve"> </w:t>
             </w:r>
           </w:p>
-          <w:bookmarkEnd w:id="80"/>
+          <w:bookmarkEnd w:id="88"/>
         </w:tc>
       </w:tr>
     </w:tbl>
@@ -1388,12 +1477,22 @@
         <w:br w:type="page"/>
       </w:r>
     </w:p>
-    <w:p>
-      <w:pPr>
-        <w:pStyle w:val="Compact"/>
-        <w:numPr>
-          <w:ilvl w:val="0"/>
-          <w:numId w:val="1011"/>
+    <w:bookmarkEnd w:id="89"/>
+    <w:bookmarkStart w:id="96" w:name="connect-half-roof-assemblies"/>
+    <w:p>
+      <w:pPr>
+        <w:pStyle w:val="Heading2"/>
+      </w:pPr>
+      <w:r>
+        <w:t xml:space="preserve">Connect Half-Roof Assemblies</w:t>
+      </w:r>
+    </w:p>
+    <w:p>
+      <w:pPr>
+        <w:pStyle w:val="Compact"/>
+        <w:numPr>
+          <w:ilvl w:val="0"/>
+          <w:numId w:val="1012"/>
         </w:numPr>
       </w:pPr>
       <w:r>
@@ -1409,18 +1508,18 @@
           <wp:inline>
             <wp:extent cx="5943600" cy="4201593"/>
             <wp:effectExtent b="0" l="0" r="0" t="0"/>
-            <wp:docPr descr="" title="" id="82" name="Picture"/>
+            <wp:docPr descr="" title="" id="91" name="Picture"/>
             <a:graphic>
               <a:graphicData uri="http://schemas.openxmlformats.org/drawingml/2006/picture">
                 <pic:pic>
                   <pic:nvPicPr>
-                    <pic:cNvPr descr="images/image_47.png" id="83" name="Picture"/>
+                    <pic:cNvPr descr="images/image_47.png" id="92" name="Picture"/>
                     <pic:cNvPicPr>
                       <a:picLocks noChangeArrowheads="1" noChangeAspect="1"/>
                     </pic:cNvPicPr>
                   </pic:nvPicPr>
                   <pic:blipFill>
-                    <a:blip r:embed="rId81"/>
+                    <a:blip r:embed="rId90"/>
                     <a:stretch>
                       <a:fillRect/>
                     </a:stretch>
@@ -1456,18 +1555,18 @@
           <wp:inline>
             <wp:extent cx="5943600" cy="4201593"/>
             <wp:effectExtent b="0" l="0" r="0" t="0"/>
-            <wp:docPr descr="" title="" id="85" name="Picture"/>
+            <wp:docPr descr="" title="" id="94" name="Picture"/>
             <a:graphic>
               <a:graphicData uri="http://schemas.openxmlformats.org/drawingml/2006/picture">
                 <pic:pic>
                   <pic:nvPicPr>
-                    <pic:cNvPr descr="images/image_48.png" id="86" name="Picture"/>
+                    <pic:cNvPr descr="images/image_48.png" id="95" name="Picture"/>
                     <pic:cNvPicPr>
                       <a:picLocks noChangeArrowheads="1" noChangeAspect="1"/>
                     </pic:cNvPicPr>
                   </pic:nvPicPr>
                   <pic:blipFill>
-                    <a:blip r:embed="rId84"/>
+                    <a:blip r:embed="rId93"/>
                     <a:stretch>
                       <a:fillRect/>
                     </a:stretch>
@@ -1499,22 +1598,22 @@
         <w:br w:type="page"/>
       </w:r>
     </w:p>
-    <w:bookmarkEnd w:id="87"/>
-    <w:bookmarkStart w:id="94" w:name="Xa75884f39ceeedc7109d43a0780b73a3081a856"/>
-    <w:p>
-      <w:pPr>
-        <w:pStyle w:val="Heading1"/>
-      </w:pPr>
-      <w:r>
-        <w:t xml:space="preserve">Screw ridge boards together to create center beam</w:t>
-      </w:r>
-    </w:p>
-    <w:p>
-      <w:pPr>
-        <w:pStyle w:val="Compact"/>
-        <w:numPr>
-          <w:ilvl w:val="0"/>
-          <w:numId w:val="1012"/>
+    <w:bookmarkEnd w:id="96"/>
+    <w:bookmarkStart w:id="103" w:name="create-center-beam"/>
+    <w:p>
+      <w:pPr>
+        <w:pStyle w:val="Heading2"/>
+      </w:pPr>
+      <w:r>
+        <w:t xml:space="preserve">Create Center Beam</w:t>
+      </w:r>
+    </w:p>
+    <w:p>
+      <w:pPr>
+        <w:pStyle w:val="Compact"/>
+        <w:numPr>
+          <w:ilvl w:val="0"/>
+          <w:numId w:val="1013"/>
         </w:numPr>
       </w:pPr>
       <w:r>
@@ -1526,7 +1625,7 @@
         <w:pStyle w:val="Compact"/>
         <w:numPr>
           <w:ilvl w:val="0"/>
-          <w:numId w:val="1012"/>
+          <w:numId w:val="1013"/>
         </w:numPr>
       </w:pPr>
       <w:r>
@@ -1542,18 +1641,18 @@
           <wp:inline>
             <wp:extent cx="5943600" cy="4201593"/>
             <wp:effectExtent b="0" l="0" r="0" t="0"/>
-            <wp:docPr descr="" title="" id="89" name="Picture"/>
+            <wp:docPr descr="" title="" id="98" name="Picture"/>
             <a:graphic>
               <a:graphicData uri="http://schemas.openxmlformats.org/drawingml/2006/picture">
                 <pic:pic>
                   <pic:nvPicPr>
-                    <pic:cNvPr descr="images/image_49.png" id="90" name="Picture"/>
+                    <pic:cNvPr descr="images/image_49.png" id="99" name="Picture"/>
                     <pic:cNvPicPr>
                       <a:picLocks noChangeArrowheads="1" noChangeAspect="1"/>
                     </pic:cNvPicPr>
                   </pic:nvPicPr>
                   <pic:blipFill>
-                    <a:blip r:embed="rId88"/>
+                    <a:blip r:embed="rId97"/>
                     <a:stretch>
                       <a:fillRect/>
                     </a:stretch>
@@ -1589,18 +1688,18 @@
           <wp:inline>
             <wp:extent cx="5943600" cy="4201593"/>
             <wp:effectExtent b="0" l="0" r="0" t="0"/>
-            <wp:docPr descr="" title="" id="92" name="Picture"/>
+            <wp:docPr descr="" title="" id="101" name="Picture"/>
             <a:graphic>
               <a:graphicData uri="http://schemas.openxmlformats.org/drawingml/2006/picture">
                 <pic:pic>
                   <pic:nvPicPr>
-                    <pic:cNvPr descr="images/image_50.png" id="93" name="Picture"/>
+                    <pic:cNvPr descr="images/image_50.png" id="102" name="Picture"/>
                     <pic:cNvPicPr>
                       <a:picLocks noChangeArrowheads="1" noChangeAspect="1"/>
                     </pic:cNvPicPr>
                   </pic:nvPicPr>
                   <pic:blipFill>
-                    <a:blip r:embed="rId91"/>
+                    <a:blip r:embed="rId100"/>
                     <a:stretch>
                       <a:fillRect/>
                     </a:stretch>
@@ -1632,22 +1731,32 @@
         <w:br w:type="page"/>
       </w:r>
     </w:p>
-    <w:bookmarkEnd w:id="94"/>
-    <w:bookmarkStart w:id="107" w:name="secure-half-roof-assemblies"/>
+    <w:bookmarkEnd w:id="103"/>
+    <w:bookmarkEnd w:id="104"/>
+    <w:bookmarkStart w:id="121" w:name="secure-roof"/>
     <w:p>
       <w:pPr>
         <w:pStyle w:val="Heading1"/>
       </w:pPr>
       <w:r>
-        <w:t xml:space="preserve">Secure half-roof assemblies</w:t>
-      </w:r>
-    </w:p>
-    <w:p>
-      <w:pPr>
-        <w:pStyle w:val="Compact"/>
-        <w:numPr>
-          <w:ilvl w:val="0"/>
-          <w:numId w:val="1013"/>
+        <w:t xml:space="preserve">Secure Roof</w:t>
+      </w:r>
+    </w:p>
+    <w:bookmarkStart w:id="108" w:name="align-half-roof-with-walls"/>
+    <w:p>
+      <w:pPr>
+        <w:pStyle w:val="Heading2"/>
+      </w:pPr>
+      <w:r>
+        <w:t xml:space="preserve">Align Half-Roof with Walls</w:t>
+      </w:r>
+    </w:p>
+    <w:p>
+      <w:pPr>
+        <w:pStyle w:val="Compact"/>
+        <w:numPr>
+          <w:ilvl w:val="0"/>
+          <w:numId w:val="1014"/>
         </w:numPr>
       </w:pPr>
       <w:r>
@@ -1671,7 +1780,7 @@
         <w:pStyle w:val="Compact"/>
         <w:numPr>
           <w:ilvl w:val="0"/>
-          <w:numId w:val="1013"/>
+          <w:numId w:val="1014"/>
         </w:numPr>
       </w:pPr>
       <w:r>
@@ -1699,18 +1808,18 @@
           <wp:inline>
             <wp:extent cx="5943600" cy="4201593"/>
             <wp:effectExtent b="0" l="0" r="0" t="0"/>
-            <wp:docPr descr="" title="" id="96" name="Picture"/>
+            <wp:docPr descr="" title="" id="106" name="Picture"/>
             <a:graphic>
               <a:graphicData uri="http://schemas.openxmlformats.org/drawingml/2006/picture">
                 <pic:pic>
                   <pic:nvPicPr>
-                    <pic:cNvPr descr="images/image_51.png" id="97" name="Picture"/>
+                    <pic:cNvPr descr="images/image_51.png" id="107" name="Picture"/>
                     <pic:cNvPicPr>
                       <a:picLocks noChangeArrowheads="1" noChangeAspect="1"/>
                     </pic:cNvPicPr>
                   </pic:nvPicPr>
                   <pic:blipFill>
-                    <a:blip r:embed="rId95"/>
+                    <a:blip r:embed="rId105"/>
                     <a:stretch>
                       <a:fillRect/>
                     </a:stretch>
@@ -1742,12 +1851,22 @@
         <w:br w:type="page"/>
       </w:r>
     </w:p>
-    <w:p>
-      <w:pPr>
-        <w:pStyle w:val="Compact"/>
-        <w:numPr>
-          <w:ilvl w:val="0"/>
-          <w:numId w:val="1014"/>
+    <w:bookmarkEnd w:id="108"/>
+    <w:bookmarkStart w:id="112" w:name="install-magic-stud-lag-bolts"/>
+    <w:p>
+      <w:pPr>
+        <w:pStyle w:val="Heading2"/>
+      </w:pPr>
+      <w:r>
+        <w:t xml:space="preserve">Install Magic Stud Lag Bolts</w:t>
+      </w:r>
+    </w:p>
+    <w:p>
+      <w:pPr>
+        <w:pStyle w:val="Compact"/>
+        <w:numPr>
+          <w:ilvl w:val="0"/>
+          <w:numId w:val="1015"/>
         </w:numPr>
       </w:pPr>
       <w:r>
@@ -1763,18 +1882,18 @@
           <wp:inline>
             <wp:extent cx="5943600" cy="4201593"/>
             <wp:effectExtent b="0" l="0" r="0" t="0"/>
-            <wp:docPr descr="" title="" id="99" name="Picture"/>
+            <wp:docPr descr="" title="" id="110" name="Picture"/>
             <a:graphic>
               <a:graphicData uri="http://schemas.openxmlformats.org/drawingml/2006/picture">
                 <pic:pic>
                   <pic:nvPicPr>
-                    <pic:cNvPr descr="images/image_52.png" id="100" name="Picture"/>
+                    <pic:cNvPr descr="images/image_52.png" id="111" name="Picture"/>
                     <pic:cNvPicPr>
                       <a:picLocks noChangeArrowheads="1" noChangeAspect="1"/>
                     </pic:cNvPicPr>
                   </pic:nvPicPr>
                   <pic:blipFill>
-                    <a:blip r:embed="rId98"/>
+                    <a:blip r:embed="rId109"/>
                     <a:stretch>
                       <a:fillRect/>
                     </a:stretch>
@@ -1806,12 +1925,22 @@
         <w:br w:type="page"/>
       </w:r>
     </w:p>
-    <w:p>
-      <w:pPr>
-        <w:pStyle w:val="Compact"/>
-        <w:numPr>
-          <w:ilvl w:val="0"/>
-          <w:numId w:val="1015"/>
+    <w:bookmarkEnd w:id="112"/>
+    <w:bookmarkStart w:id="116" w:name="secure-brackets"/>
+    <w:p>
+      <w:pPr>
+        <w:pStyle w:val="Heading2"/>
+      </w:pPr>
+      <w:r>
+        <w:t xml:space="preserve">Secure Brackets</w:t>
+      </w:r>
+    </w:p>
+    <w:p>
+      <w:pPr>
+        <w:pStyle w:val="Compact"/>
+        <w:numPr>
+          <w:ilvl w:val="0"/>
+          <w:numId w:val="1016"/>
         </w:numPr>
       </w:pPr>
       <w:r>
@@ -1827,18 +1956,18 @@
           <wp:inline>
             <wp:extent cx="5943600" cy="4201593"/>
             <wp:effectExtent b="0" l="0" r="0" t="0"/>
-            <wp:docPr descr="" title="" id="102" name="Picture"/>
+            <wp:docPr descr="" title="" id="114" name="Picture"/>
             <a:graphic>
               <a:graphicData uri="http://schemas.openxmlformats.org/drawingml/2006/picture">
                 <pic:pic>
                   <pic:nvPicPr>
-                    <pic:cNvPr descr="images/image_53.png" id="103" name="Picture"/>
+                    <pic:cNvPr descr="images/image_53.png" id="115" name="Picture"/>
                     <pic:cNvPicPr>
                       <a:picLocks noChangeArrowheads="1" noChangeAspect="1"/>
                     </pic:cNvPicPr>
                   </pic:nvPicPr>
                   <pic:blipFill>
-                    <a:blip r:embed="rId101"/>
+                    <a:blip r:embed="rId113"/>
                     <a:stretch>
                       <a:fillRect/>
                     </a:stretch>
@@ -1870,12 +1999,22 @@
         <w:br w:type="page"/>
       </w:r>
     </w:p>
-    <w:p>
-      <w:pPr>
-        <w:pStyle w:val="Compact"/>
-        <w:numPr>
-          <w:ilvl w:val="0"/>
-          <w:numId w:val="1016"/>
+    <w:bookmarkEnd w:id="116"/>
+    <w:bookmarkStart w:id="120" w:name="install-all-lag-bolts"/>
+    <w:p>
+      <w:pPr>
+        <w:pStyle w:val="Heading2"/>
+      </w:pPr>
+      <w:r>
+        <w:t xml:space="preserve">Install All Lag Bolts</w:t>
+      </w:r>
+    </w:p>
+    <w:p>
+      <w:pPr>
+        <w:pStyle w:val="Compact"/>
+        <w:numPr>
+          <w:ilvl w:val="0"/>
+          <w:numId w:val="1017"/>
         </w:numPr>
       </w:pPr>
       <w:r>
@@ -1885,286 +2024,6 @@
     <w:p>
       <w:pPr>
         <w:pStyle w:val="FirstParagraph"/>
-      </w:pPr>
-      <w:r>
-        <w:drawing>
-          <wp:inline>
-            <wp:extent cx="5943600" cy="4201593"/>
-            <wp:effectExtent b="0" l="0" r="0" t="0"/>
-            <wp:docPr descr="" title="" id="105" name="Picture"/>
-            <a:graphic>
-              <a:graphicData uri="http://schemas.openxmlformats.org/drawingml/2006/picture">
-                <pic:pic>
-                  <pic:nvPicPr>
-                    <pic:cNvPr descr="images/image_54.png" id="106" name="Picture"/>
-                    <pic:cNvPicPr>
-                      <a:picLocks noChangeArrowheads="1" noChangeAspect="1"/>
-                    </pic:cNvPicPr>
-                  </pic:nvPicPr>
-                  <pic:blipFill>
-                    <a:blip r:embed="rId104"/>
-                    <a:stretch>
-                      <a:fillRect/>
-                    </a:stretch>
-                  </pic:blipFill>
-                  <pic:spPr bwMode="auto">
-                    <a:xfrm>
-                      <a:off x="0" y="0"/>
-                      <a:ext cx="5943600" cy="4201593"/>
-                    </a:xfrm>
-                    <a:prstGeom prst="rect">
-                      <a:avLst/>
-                    </a:prstGeom>
-                    <a:noFill/>
-                    <a:ln w="9525">
-                      <a:noFill/>
-                      <a:headEnd/>
-                      <a:tailEnd/>
-                    </a:ln>
-                  </pic:spPr>
-                </pic:pic>
-              </a:graphicData>
-            </a:graphic>
-          </wp:inline>
-        </w:drawing>
-      </w:r>
-    </w:p>
-    <w:p>
-      <w:r>
-        <w:br w:type="page"/>
-      </w:r>
-    </w:p>
-    <w:bookmarkEnd w:id="107"/>
-    <w:bookmarkStart w:id="120" w:name="install-bird-blocking"/>
-    <w:p>
-      <w:pPr>
-        <w:pStyle w:val="Heading1"/>
-      </w:pPr>
-      <w:r>
-        <w:t xml:space="preserve">Install bird blocking</w:t>
-      </w:r>
-    </w:p>
-    <w:p>
-      <w:pPr>
-        <w:pStyle w:val="Compact"/>
-        <w:numPr>
-          <w:ilvl w:val="0"/>
-          <w:numId w:val="1017"/>
-        </w:numPr>
-      </w:pPr>
-      <w:r>
-        <w:t xml:space="preserve">Collect a set of bird blocks from the tall shelves. There should be four blocks labeled</w:t>
-      </w:r>
-      <w:r>
-        <w:t xml:space="preserve"> </w:t>
-      </w:r>
-      <w:r>
-        <w:t xml:space="preserve">“E”</w:t>
-      </w:r>
-      <w:r>
-        <w:t xml:space="preserve"> </w:t>
-      </w:r>
-      <w:r>
-        <w:t xml:space="preserve">(for the end bays) and eight blocks unlabeled (for the middle bays).</w:t>
-      </w:r>
-    </w:p>
-    <w:p>
-      <w:pPr>
-        <w:pStyle w:val="Compact"/>
-        <w:numPr>
-          <w:ilvl w:val="0"/>
-          <w:numId w:val="1017"/>
-        </w:numPr>
-      </w:pPr>
-      <w:r>
-        <w:t xml:space="preserve">One crew member is stationed on a ladder outside the home; the other, inside, has a screw gun and a box of #10 x 3” screws.</w:t>
-      </w:r>
-    </w:p>
-    <w:p>
-      <w:pPr>
-        <w:pStyle w:val="Compact"/>
-        <w:numPr>
-          <w:ilvl w:val="0"/>
-          <w:numId w:val="1017"/>
-        </w:numPr>
-      </w:pPr>
-      <w:r>
-        <w:t xml:space="preserve">The outside person positions each block, tapping gently with a mallet, so that it is flat against the top plate of the side wall, and tucked just under the edge of the white board at the bottom edge of the roof. If a block is shorter than the space between the rafters, it should be centered; if it is too long, cut it off with a chop saw</w:t>
-      </w:r>
-    </w:p>
-    <w:p>
-      <w:pPr>
-        <w:pStyle w:val="FirstParagraph"/>
-      </w:pPr>
-      <w:r>
-        <w:drawing>
-          <wp:inline>
-            <wp:extent cx="5943600" cy="4201593"/>
-            <wp:effectExtent b="0" l="0" r="0" t="0"/>
-            <wp:docPr descr="" title="" id="109" name="Picture"/>
-            <a:graphic>
-              <a:graphicData uri="http://schemas.openxmlformats.org/drawingml/2006/picture">
-                <pic:pic>
-                  <pic:nvPicPr>
-                    <pic:cNvPr descr="images/image_56.png" id="110" name="Picture"/>
-                    <pic:cNvPicPr>
-                      <a:picLocks noChangeArrowheads="1" noChangeAspect="1"/>
-                    </pic:cNvPicPr>
-                  </pic:nvPicPr>
-                  <pic:blipFill>
-                    <a:blip r:embed="rId108"/>
-                    <a:stretch>
-                      <a:fillRect/>
-                    </a:stretch>
-                  </pic:blipFill>
-                  <pic:spPr bwMode="auto">
-                    <a:xfrm>
-                      <a:off x="0" y="0"/>
-                      <a:ext cx="5943600" cy="4201593"/>
-                    </a:xfrm>
-                    <a:prstGeom prst="rect">
-                      <a:avLst/>
-                    </a:prstGeom>
-                    <a:noFill/>
-                    <a:ln w="9525">
-                      <a:noFill/>
-                      <a:headEnd/>
-                      <a:tailEnd/>
-                    </a:ln>
-                  </pic:spPr>
-                </pic:pic>
-              </a:graphicData>
-            </a:graphic>
-          </wp:inline>
-        </w:drawing>
-      </w:r>
-    </w:p>
-    <w:p>
-      <w:pPr>
-        <w:pStyle w:val="BodyText"/>
-      </w:pPr>
-      <w:r>
-        <w:drawing>
-          <wp:inline>
-            <wp:extent cx="5943600" cy="4201593"/>
-            <wp:effectExtent b="0" l="0" r="0" t="0"/>
-            <wp:docPr descr="" title="" id="112" name="Picture"/>
-            <a:graphic>
-              <a:graphicData uri="http://schemas.openxmlformats.org/drawingml/2006/picture">
-                <pic:pic>
-                  <pic:nvPicPr>
-                    <pic:cNvPr descr="images/image_57.png" id="113" name="Picture"/>
-                    <pic:cNvPicPr>
-                      <a:picLocks noChangeArrowheads="1" noChangeAspect="1"/>
-                    </pic:cNvPicPr>
-                  </pic:nvPicPr>
-                  <pic:blipFill>
-                    <a:blip r:embed="rId111"/>
-                    <a:stretch>
-                      <a:fillRect/>
-                    </a:stretch>
-                  </pic:blipFill>
-                  <pic:spPr bwMode="auto">
-                    <a:xfrm>
-                      <a:off x="0" y="0"/>
-                      <a:ext cx="5943600" cy="4201593"/>
-                    </a:xfrm>
-                    <a:prstGeom prst="rect">
-                      <a:avLst/>
-                    </a:prstGeom>
-                    <a:noFill/>
-                    <a:ln w="9525">
-                      <a:noFill/>
-                      <a:headEnd/>
-                      <a:tailEnd/>
-                    </a:ln>
-                  </pic:spPr>
-                </pic:pic>
-              </a:graphicData>
-            </a:graphic>
-          </wp:inline>
-        </w:drawing>
-      </w:r>
-    </w:p>
-    <w:p>
-      <w:r>
-        <w:br w:type="page"/>
-      </w:r>
-    </w:p>
-    <w:p>
-      <w:pPr>
-        <w:pStyle w:val="Compact"/>
-        <w:numPr>
-          <w:ilvl w:val="0"/>
-          <w:numId w:val="1018"/>
-        </w:numPr>
-      </w:pPr>
-      <w:r>
-        <w:t xml:space="preserve">When a block is in position, the inside person drives two brown screws up through the top plate of the side wall into the bird block.</w:t>
-      </w:r>
-    </w:p>
-    <w:p>
-      <w:pPr>
-        <w:pStyle w:val="Compact"/>
-        <w:numPr>
-          <w:ilvl w:val="0"/>
-          <w:numId w:val="1018"/>
-        </w:numPr>
-      </w:pPr>
-      <w:r>
-        <w:t xml:space="preserve">The outside person then inspects the block to make sure that no screw ends are visible on the outside of the home. If one is found protruding, it must be removed and reinstalled correctly.</w:t>
-      </w:r>
-    </w:p>
-    <w:p>
-      <w:pPr>
-        <w:pStyle w:val="FirstParagraph"/>
-      </w:pPr>
-      <w:r>
-        <w:drawing>
-          <wp:inline>
-            <wp:extent cx="5943600" cy="4201593"/>
-            <wp:effectExtent b="0" l="0" r="0" t="0"/>
-            <wp:docPr descr="" title="" id="115" name="Picture"/>
-            <a:graphic>
-              <a:graphicData uri="http://schemas.openxmlformats.org/drawingml/2006/picture">
-                <pic:pic>
-                  <pic:nvPicPr>
-                    <pic:cNvPr descr="images/image_58.png" id="116" name="Picture"/>
-                    <pic:cNvPicPr>
-                      <a:picLocks noChangeArrowheads="1" noChangeAspect="1"/>
-                    </pic:cNvPicPr>
-                  </pic:nvPicPr>
-                  <pic:blipFill>
-                    <a:blip r:embed="rId114"/>
-                    <a:stretch>
-                      <a:fillRect/>
-                    </a:stretch>
-                  </pic:blipFill>
-                  <pic:spPr bwMode="auto">
-                    <a:xfrm>
-                      <a:off x="0" y="0"/>
-                      <a:ext cx="5943600" cy="4201593"/>
-                    </a:xfrm>
-                    <a:prstGeom prst="rect">
-                      <a:avLst/>
-                    </a:prstGeom>
-                    <a:noFill/>
-                    <a:ln w="9525">
-                      <a:noFill/>
-                      <a:headEnd/>
-                      <a:tailEnd/>
-                    </a:ln>
-                  </pic:spPr>
-                </pic:pic>
-              </a:graphicData>
-            </a:graphic>
-          </wp:inline>
-        </w:drawing>
-      </w:r>
-    </w:p>
-    <w:p>
-      <w:pPr>
-        <w:pStyle w:val="BodyText"/>
       </w:pPr>
       <w:r>
         <w:drawing>
@@ -2176,7 +2035,7 @@
               <a:graphicData uri="http://schemas.openxmlformats.org/drawingml/2006/picture">
                 <pic:pic>
                   <pic:nvPicPr>
-                    <pic:cNvPr descr="images/image_59.png" id="119" name="Picture"/>
+                    <pic:cNvPr descr="images/image_54.png" id="119" name="Picture"/>
                     <pic:cNvPicPr>
                       <a:picLocks noChangeArrowheads="1" noChangeAspect="1"/>
                     </pic:cNvPicPr>
@@ -2215,25 +2074,62 @@
       </w:r>
     </w:p>
     <w:bookmarkEnd w:id="120"/>
-    <w:bookmarkStart w:id="133" w:name="install-ridge-vent-blocks"/>
+    <w:bookmarkEnd w:id="121"/>
+    <w:bookmarkStart w:id="136" w:name="install-bird-blocking"/>
     <w:p>
       <w:pPr>
         <w:pStyle w:val="Heading1"/>
       </w:pPr>
       <w:r>
-        <w:t xml:space="preserve">Install ridge vent blocks</w:t>
-      </w:r>
-    </w:p>
-    <w:p>
-      <w:pPr>
-        <w:pStyle w:val="Compact"/>
-        <w:numPr>
-          <w:ilvl w:val="0"/>
-          <w:numId w:val="1019"/>
-        </w:numPr>
-      </w:pPr>
-      <w:r>
-        <w:t xml:space="preserve">Position a 1x8 white board (guide board) just down from the peak of the roof on one side; clamp it in place at both ends and in the middle.</w:t>
+        <w:t xml:space="preserve">Install Bird Blocking</w:t>
+      </w:r>
+    </w:p>
+    <w:p>
+      <w:pPr>
+        <w:pStyle w:val="Compact"/>
+        <w:numPr>
+          <w:ilvl w:val="0"/>
+          <w:numId w:val="1018"/>
+        </w:numPr>
+      </w:pPr>
+      <w:r>
+        <w:t xml:space="preserve">Collect a set of bird blocks from the tall shelves. There should be four blocks labeled</w:t>
+      </w:r>
+      <w:r>
+        <w:t xml:space="preserve"> </w:t>
+      </w:r>
+      <w:r>
+        <w:t xml:space="preserve">“E”</w:t>
+      </w:r>
+      <w:r>
+        <w:t xml:space="preserve"> </w:t>
+      </w:r>
+      <w:r>
+        <w:t xml:space="preserve">(for the end bays) and eight blocks unlabeled (for the middle bays).</w:t>
+      </w:r>
+    </w:p>
+    <w:p>
+      <w:pPr>
+        <w:pStyle w:val="Compact"/>
+        <w:numPr>
+          <w:ilvl w:val="0"/>
+          <w:numId w:val="1018"/>
+        </w:numPr>
+      </w:pPr>
+      <w:r>
+        <w:t xml:space="preserve">One crew member is stationed on a ladder outside the home; the other, inside, has a screw gun and a box of #10 x 3” screws.</w:t>
+      </w:r>
+    </w:p>
+    <w:p>
+      <w:pPr>
+        <w:pStyle w:val="Compact"/>
+        <w:numPr>
+          <w:ilvl w:val="0"/>
+          <w:numId w:val="1018"/>
+        </w:numPr>
+      </w:pPr>
+      <w:r>
+        <w:t xml:space="preserve">The outside person positions each block, tapping gently with a mallet, so that it is flat against the top plate of the side wall, and tucked just under the edge of the white board at the bottom edge of the roof. If a block is shorter than the space between the rafters, it should be centered; if it is too long, cut it off with a chop saw</w:t>
       </w:r>
     </w:p>
     <w:p>
@@ -2245,18 +2141,18 @@
           <wp:inline>
             <wp:extent cx="5943600" cy="4201593"/>
             <wp:effectExtent b="0" l="0" r="0" t="0"/>
-            <wp:docPr descr="" title="" id="122" name="Picture"/>
+            <wp:docPr descr="" title="" id="123" name="Picture"/>
             <a:graphic>
               <a:graphicData uri="http://schemas.openxmlformats.org/drawingml/2006/picture">
                 <pic:pic>
                   <pic:nvPicPr>
-                    <pic:cNvPr descr="images/image_60.png" id="123" name="Picture"/>
+                    <pic:cNvPr descr="images/image_56.png" id="124" name="Picture"/>
                     <pic:cNvPicPr>
                       <a:picLocks noChangeArrowheads="1" noChangeAspect="1"/>
                     </pic:cNvPicPr>
                   </pic:nvPicPr>
                   <pic:blipFill>
-                    <a:blip r:embed="rId121"/>
+                    <a:blip r:embed="rId122"/>
                     <a:stretch>
                       <a:fillRect/>
                     </a:stretch>
@@ -2285,61 +2181,25 @@
     </w:p>
     <w:p>
       <w:pPr>
-        <w:pStyle w:val="Compact"/>
-        <w:numPr>
-          <w:ilvl w:val="0"/>
-          <w:numId w:val="1020"/>
-        </w:numPr>
-      </w:pPr>
-      <w:r>
-        <w:t xml:space="preserve">Collect a set of vent blocks from the tall shelves. There should be 4 marked</w:t>
-      </w:r>
-      <w:r>
-        <w:t xml:space="preserve"> </w:t>
-      </w:r>
-      <w:r>
-        <w:t xml:space="preserve">“END”</w:t>
-      </w:r>
-      <w:r>
-        <w:t xml:space="preserve"> </w:t>
-      </w:r>
-      <w:r>
-        <w:t xml:space="preserve">and 8 unmarked.</w:t>
-      </w:r>
-    </w:p>
-    <w:p>
-      <w:pPr>
-        <w:pStyle w:val="Compact"/>
-        <w:numPr>
-          <w:ilvl w:val="0"/>
-          <w:numId w:val="1020"/>
-        </w:numPr>
-      </w:pPr>
-      <w:r>
-        <w:t xml:space="preserve">Preset three #10 x 3” screws in each vent block.</w:t>
-      </w:r>
-    </w:p>
-    <w:p>
-      <w:pPr>
-        <w:pStyle w:val="FirstParagraph"/>
+        <w:pStyle w:val="BodyText"/>
       </w:pPr>
       <w:r>
         <w:drawing>
           <wp:inline>
             <wp:extent cx="5943600" cy="4201593"/>
             <wp:effectExtent b="0" l="0" r="0" t="0"/>
-            <wp:docPr descr="" title="" id="125" name="Picture"/>
+            <wp:docPr descr="" title="" id="126" name="Picture"/>
             <a:graphic>
               <a:graphicData uri="http://schemas.openxmlformats.org/drawingml/2006/picture">
                 <pic:pic>
                   <pic:nvPicPr>
-                    <pic:cNvPr descr="images/image_61.png" id="126" name="Picture"/>
+                    <pic:cNvPr descr="images/image_57.png" id="127" name="Picture"/>
                     <pic:cNvPicPr>
                       <a:picLocks noChangeArrowheads="1" noChangeAspect="1"/>
                     </pic:cNvPicPr>
                   </pic:nvPicPr>
                   <pic:blipFill>
-                    <a:blip r:embed="rId124"/>
+                    <a:blip r:embed="rId125"/>
                     <a:stretch>
                       <a:fillRect/>
                     </a:stretch>
@@ -2367,15 +2227,41 @@
       </w:r>
     </w:p>
     <w:p>
-      <w:pPr>
-        <w:pStyle w:val="Compact"/>
-        <w:numPr>
-          <w:ilvl w:val="0"/>
-          <w:numId w:val="1021"/>
-        </w:numPr>
-      </w:pPr>
-      <w:r>
-        <w:t xml:space="preserve">In each bay (between the rafters), position a vent block so that it just touches the guide board, clamp it in place, and drive the three screws into the white board. If the vent block is too long, it can be cut off with a chop saw, but you may need to remove a screw for clearance. It is important that the vent block end up tight against the white board. If there is a gap, back the screws out, reclamp, and then drive the screws back in again. This will ensure that the roof panels will actually fit when they are installed.</w:t>
+      <w:r>
+        <w:br w:type="page"/>
+      </w:r>
+    </w:p>
+    <w:bookmarkStart w:id="131" w:name="attach-bird-blocking"/>
+    <w:p>
+      <w:pPr>
+        <w:pStyle w:val="Heading2"/>
+      </w:pPr>
+      <w:r>
+        <w:t xml:space="preserve">Attach Bird Blocking</w:t>
+      </w:r>
+    </w:p>
+    <w:p>
+      <w:pPr>
+        <w:pStyle w:val="Compact"/>
+        <w:numPr>
+          <w:ilvl w:val="0"/>
+          <w:numId w:val="1019"/>
+        </w:numPr>
+      </w:pPr>
+      <w:r>
+        <w:t xml:space="preserve">When a block is in position, the inside person drives two brown screws up through the top plate of the side wall into the bird block.</w:t>
+      </w:r>
+    </w:p>
+    <w:p>
+      <w:pPr>
+        <w:pStyle w:val="Compact"/>
+        <w:numPr>
+          <w:ilvl w:val="0"/>
+          <w:numId w:val="1019"/>
+        </w:numPr>
+      </w:pPr>
+      <w:r>
+        <w:t xml:space="preserve">The outside person then inspects the block to make sure that no screw ends are visible on the outside of the home. If one is found protruding, it must be removed and reinstalled correctly.</w:t>
       </w:r>
     </w:p>
     <w:p>
@@ -2387,18 +2273,18 @@
           <wp:inline>
             <wp:extent cx="5943600" cy="4201593"/>
             <wp:effectExtent b="0" l="0" r="0" t="0"/>
-            <wp:docPr descr="" title="" id="128" name="Picture"/>
+            <wp:docPr descr="" title="" id="129" name="Picture"/>
             <a:graphic>
               <a:graphicData uri="http://schemas.openxmlformats.org/drawingml/2006/picture">
                 <pic:pic>
                   <pic:nvPicPr>
-                    <pic:cNvPr descr="images/image_62.png" id="129" name="Picture"/>
+                    <pic:cNvPr descr="images/image_58.png" id="130" name="Picture"/>
                     <pic:cNvPicPr>
                       <a:picLocks noChangeArrowheads="1" noChangeAspect="1"/>
                     </pic:cNvPicPr>
                   </pic:nvPicPr>
                   <pic:blipFill>
-                    <a:blip r:embed="rId127"/>
+                    <a:blip r:embed="rId128"/>
                     <a:stretch>
                       <a:fillRect/>
                     </a:stretch>
@@ -2425,40 +2311,14 @@
         </w:drawing>
       </w:r>
     </w:p>
-    <w:p>
-      <w:pPr>
-        <w:pStyle w:val="Compact"/>
-        <w:numPr>
-          <w:ilvl w:val="0"/>
-          <w:numId w:val="1022"/>
-        </w:numPr>
-      </w:pPr>
-      <w:r>
-        <w:t xml:space="preserve">Move the guide board to the other side of the roof peak.</w:t>
-      </w:r>
-    </w:p>
-    <w:p>
-      <w:pPr>
-        <w:pStyle w:val="Compact"/>
-        <w:numPr>
-          <w:ilvl w:val="0"/>
-          <w:numId w:val="1022"/>
-        </w:numPr>
-      </w:pPr>
-      <w:r>
-        <w:t xml:space="preserve">Install the remaining vent blocks on the other side of the roof peak.</w:t>
-      </w:r>
-    </w:p>
-    <w:p>
-      <w:pPr>
-        <w:pStyle w:val="Compact"/>
-        <w:numPr>
-          <w:ilvl w:val="0"/>
-          <w:numId w:val="1022"/>
-        </w:numPr>
-      </w:pPr>
-      <w:r>
-        <w:t xml:space="preserve">Unclamp the guide board, and return it to the rack.</w:t>
+    <w:bookmarkEnd w:id="131"/>
+    <w:bookmarkStart w:id="135" w:name="complete-for-all-bird-blocking"/>
+    <w:p>
+      <w:pPr>
+        <w:pStyle w:val="Heading2"/>
+      </w:pPr>
+      <w:r>
+        <w:t xml:space="preserve">Complete for All Bird Blocking</w:t>
       </w:r>
     </w:p>
     <w:p>
@@ -2470,18 +2330,18 @@
           <wp:inline>
             <wp:extent cx="5943600" cy="4201593"/>
             <wp:effectExtent b="0" l="0" r="0" t="0"/>
-            <wp:docPr descr="" title="" id="131" name="Picture"/>
+            <wp:docPr descr="" title="" id="133" name="Picture"/>
             <a:graphic>
               <a:graphicData uri="http://schemas.openxmlformats.org/drawingml/2006/picture">
                 <pic:pic>
                   <pic:nvPicPr>
-                    <pic:cNvPr descr="images/image_63.png" id="132" name="Picture"/>
+                    <pic:cNvPr descr="images/image_59.png" id="134" name="Picture"/>
                     <pic:cNvPicPr>
                       <a:picLocks noChangeArrowheads="1" noChangeAspect="1"/>
                     </pic:cNvPicPr>
                   </pic:nvPicPr>
                   <pic:blipFill>
-                    <a:blip r:embed="rId130"/>
+                    <a:blip r:embed="rId132"/>
                     <a:stretch>
                       <a:fillRect/>
                     </a:stretch>
@@ -2508,7 +2368,337 @@
         </w:drawing>
       </w:r>
     </w:p>
-    <w:bookmarkEnd w:id="133"/>
+    <w:p>
+      <w:r>
+        <w:br w:type="page"/>
+      </w:r>
+    </w:p>
+    <w:bookmarkEnd w:id="135"/>
+    <w:bookmarkEnd w:id="136"/>
+    <w:bookmarkStart w:id="152" w:name="install-ridge-vent-blocks"/>
+    <w:p>
+      <w:pPr>
+        <w:pStyle w:val="Heading1"/>
+      </w:pPr>
+      <w:r>
+        <w:t xml:space="preserve">Install Ridge Vent Blocks</w:t>
+      </w:r>
+    </w:p>
+    <w:p>
+      <w:pPr>
+        <w:pStyle w:val="Compact"/>
+        <w:numPr>
+          <w:ilvl w:val="0"/>
+          <w:numId w:val="1020"/>
+        </w:numPr>
+      </w:pPr>
+      <w:r>
+        <w:t xml:space="preserve">Position a 1x8 white board (guide board) just down from the peak of the roof on one side; clamp it in place at both ends and in the middle.</w:t>
+      </w:r>
+    </w:p>
+    <w:p>
+      <w:pPr>
+        <w:pStyle w:val="FirstParagraph"/>
+      </w:pPr>
+      <w:r>
+        <w:drawing>
+          <wp:inline>
+            <wp:extent cx="5943600" cy="4201593"/>
+            <wp:effectExtent b="0" l="0" r="0" t="0"/>
+            <wp:docPr descr="" title="" id="138" name="Picture"/>
+            <a:graphic>
+              <a:graphicData uri="http://schemas.openxmlformats.org/drawingml/2006/picture">
+                <pic:pic>
+                  <pic:nvPicPr>
+                    <pic:cNvPr descr="images/image_60.png" id="139" name="Picture"/>
+                    <pic:cNvPicPr>
+                      <a:picLocks noChangeArrowheads="1" noChangeAspect="1"/>
+                    </pic:cNvPicPr>
+                  </pic:nvPicPr>
+                  <pic:blipFill>
+                    <a:blip r:embed="rId137"/>
+                    <a:stretch>
+                      <a:fillRect/>
+                    </a:stretch>
+                  </pic:blipFill>
+                  <pic:spPr bwMode="auto">
+                    <a:xfrm>
+                      <a:off x="0" y="0"/>
+                      <a:ext cx="5943600" cy="4201593"/>
+                    </a:xfrm>
+                    <a:prstGeom prst="rect">
+                      <a:avLst/>
+                    </a:prstGeom>
+                    <a:noFill/>
+                    <a:ln w="9525">
+                      <a:noFill/>
+                      <a:headEnd/>
+                      <a:tailEnd/>
+                    </a:ln>
+                  </pic:spPr>
+                </pic:pic>
+              </a:graphicData>
+            </a:graphic>
+          </wp:inline>
+        </w:drawing>
+      </w:r>
+    </w:p>
+    <w:p>
+      <w:pPr>
+        <w:pStyle w:val="Compact"/>
+        <w:numPr>
+          <w:ilvl w:val="0"/>
+          <w:numId w:val="1021"/>
+        </w:numPr>
+      </w:pPr>
+      <w:r>
+        <w:t xml:space="preserve">Collect a set of vent blocks from the tall shelves. There should be 4 marked</w:t>
+      </w:r>
+      <w:r>
+        <w:t xml:space="preserve"> </w:t>
+      </w:r>
+      <w:r>
+        <w:t xml:space="preserve">“END”</w:t>
+      </w:r>
+      <w:r>
+        <w:t xml:space="preserve"> </w:t>
+      </w:r>
+      <w:r>
+        <w:t xml:space="preserve">and 8 unmarked.</w:t>
+      </w:r>
+    </w:p>
+    <w:p>
+      <w:pPr>
+        <w:pStyle w:val="Compact"/>
+        <w:numPr>
+          <w:ilvl w:val="0"/>
+          <w:numId w:val="1021"/>
+        </w:numPr>
+      </w:pPr>
+      <w:r>
+        <w:t xml:space="preserve">Preset three #10 x 3” screws in each vent block.</w:t>
+      </w:r>
+    </w:p>
+    <w:bookmarkStart w:id="143" w:name="align-and-clamp-ridge-vent"/>
+    <w:p>
+      <w:pPr>
+        <w:pStyle w:val="Heading2"/>
+      </w:pPr>
+      <w:r>
+        <w:t xml:space="preserve">Align and Clamp Ridge Vent</w:t>
+      </w:r>
+    </w:p>
+    <w:p>
+      <w:pPr>
+        <w:pStyle w:val="FirstParagraph"/>
+      </w:pPr>
+      <w:r>
+        <w:drawing>
+          <wp:inline>
+            <wp:extent cx="5943600" cy="4201593"/>
+            <wp:effectExtent b="0" l="0" r="0" t="0"/>
+            <wp:docPr descr="" title="" id="141" name="Picture"/>
+            <a:graphic>
+              <a:graphicData uri="http://schemas.openxmlformats.org/drawingml/2006/picture">
+                <pic:pic>
+                  <pic:nvPicPr>
+                    <pic:cNvPr descr="images/image_61.png" id="142" name="Picture"/>
+                    <pic:cNvPicPr>
+                      <a:picLocks noChangeArrowheads="1" noChangeAspect="1"/>
+                    </pic:cNvPicPr>
+                  </pic:nvPicPr>
+                  <pic:blipFill>
+                    <a:blip r:embed="rId140"/>
+                    <a:stretch>
+                      <a:fillRect/>
+                    </a:stretch>
+                  </pic:blipFill>
+                  <pic:spPr bwMode="auto">
+                    <a:xfrm>
+                      <a:off x="0" y="0"/>
+                      <a:ext cx="5943600" cy="4201593"/>
+                    </a:xfrm>
+                    <a:prstGeom prst="rect">
+                      <a:avLst/>
+                    </a:prstGeom>
+                    <a:noFill/>
+                    <a:ln w="9525">
+                      <a:noFill/>
+                      <a:headEnd/>
+                      <a:tailEnd/>
+                    </a:ln>
+                  </pic:spPr>
+                </pic:pic>
+              </a:graphicData>
+            </a:graphic>
+          </wp:inline>
+        </w:drawing>
+      </w:r>
+    </w:p>
+    <w:p>
+      <w:pPr>
+        <w:pStyle w:val="Compact"/>
+        <w:numPr>
+          <w:ilvl w:val="0"/>
+          <w:numId w:val="1022"/>
+        </w:numPr>
+      </w:pPr>
+      <w:r>
+        <w:t xml:space="preserve">In each bay (between the rafters), position a vent block so that it just touches the guide board, clamp it in place, and drive the three screws into the white board. If the vent block is too long, it can be cut off with a chop saw, but you may need to remove a screw for clearance. It is important that the vent block end up tight against the white board. If there is a gap, back the screws out, reclamp, and then drive the screws back in again. This will ensure that the roof panels will actually fit when they are installed.</w:t>
+      </w:r>
+    </w:p>
+    <w:bookmarkEnd w:id="143"/>
+    <w:bookmarkStart w:id="147" w:name="secure-ridge-vent"/>
+    <w:p>
+      <w:pPr>
+        <w:pStyle w:val="Heading2"/>
+      </w:pPr>
+      <w:r>
+        <w:t xml:space="preserve">Secure Ridge Vent</w:t>
+      </w:r>
+    </w:p>
+    <w:p>
+      <w:pPr>
+        <w:pStyle w:val="FirstParagraph"/>
+      </w:pPr>
+      <w:r>
+        <w:drawing>
+          <wp:inline>
+            <wp:extent cx="5943600" cy="4201593"/>
+            <wp:effectExtent b="0" l="0" r="0" t="0"/>
+            <wp:docPr descr="" title="" id="145" name="Picture"/>
+            <a:graphic>
+              <a:graphicData uri="http://schemas.openxmlformats.org/drawingml/2006/picture">
+                <pic:pic>
+                  <pic:nvPicPr>
+                    <pic:cNvPr descr="images/image_62.png" id="146" name="Picture"/>
+                    <pic:cNvPicPr>
+                      <a:picLocks noChangeArrowheads="1" noChangeAspect="1"/>
+                    </pic:cNvPicPr>
+                  </pic:nvPicPr>
+                  <pic:blipFill>
+                    <a:blip r:embed="rId144"/>
+                    <a:stretch>
+                      <a:fillRect/>
+                    </a:stretch>
+                  </pic:blipFill>
+                  <pic:spPr bwMode="auto">
+                    <a:xfrm>
+                      <a:off x="0" y="0"/>
+                      <a:ext cx="5943600" cy="4201593"/>
+                    </a:xfrm>
+                    <a:prstGeom prst="rect">
+                      <a:avLst/>
+                    </a:prstGeom>
+                    <a:noFill/>
+                    <a:ln w="9525">
+                      <a:noFill/>
+                      <a:headEnd/>
+                      <a:tailEnd/>
+                    </a:ln>
+                  </pic:spPr>
+                </pic:pic>
+              </a:graphicData>
+            </a:graphic>
+          </wp:inline>
+        </w:drawing>
+      </w:r>
+    </w:p>
+    <w:p>
+      <w:pPr>
+        <w:pStyle w:val="Compact"/>
+        <w:numPr>
+          <w:ilvl w:val="0"/>
+          <w:numId w:val="1023"/>
+        </w:numPr>
+      </w:pPr>
+      <w:r>
+        <w:t xml:space="preserve">Move the guide board to the other side of the roof peak.</w:t>
+      </w:r>
+    </w:p>
+    <w:p>
+      <w:pPr>
+        <w:pStyle w:val="Compact"/>
+        <w:numPr>
+          <w:ilvl w:val="0"/>
+          <w:numId w:val="1023"/>
+        </w:numPr>
+      </w:pPr>
+      <w:r>
+        <w:t xml:space="preserve">Install the remaining vent blocks on the other side of the roof peak.</w:t>
+      </w:r>
+    </w:p>
+    <w:p>
+      <w:pPr>
+        <w:pStyle w:val="Compact"/>
+        <w:numPr>
+          <w:ilvl w:val="0"/>
+          <w:numId w:val="1023"/>
+        </w:numPr>
+      </w:pPr>
+      <w:r>
+        <w:t xml:space="preserve">Unclamp the guide board, and return it to the rack.</w:t>
+      </w:r>
+    </w:p>
+    <w:bookmarkEnd w:id="147"/>
+    <w:bookmarkStart w:id="151" w:name="complete-for-all-ridge-vents"/>
+    <w:p>
+      <w:pPr>
+        <w:pStyle w:val="Heading2"/>
+      </w:pPr>
+      <w:r>
+        <w:t xml:space="preserve">Complete for All Ridge Vents</w:t>
+      </w:r>
+    </w:p>
+    <w:p>
+      <w:pPr>
+        <w:pStyle w:val="FirstParagraph"/>
+      </w:pPr>
+      <w:r>
+        <w:drawing>
+          <wp:inline>
+            <wp:extent cx="5943600" cy="4201593"/>
+            <wp:effectExtent b="0" l="0" r="0" t="0"/>
+            <wp:docPr descr="" title="" id="149" name="Picture"/>
+            <a:graphic>
+              <a:graphicData uri="http://schemas.openxmlformats.org/drawingml/2006/picture">
+                <pic:pic>
+                  <pic:nvPicPr>
+                    <pic:cNvPr descr="images/image_63.png" id="150" name="Picture"/>
+                    <pic:cNvPicPr>
+                      <a:picLocks noChangeArrowheads="1" noChangeAspect="1"/>
+                    </pic:cNvPicPr>
+                  </pic:nvPicPr>
+                  <pic:blipFill>
+                    <a:blip r:embed="rId148"/>
+                    <a:stretch>
+                      <a:fillRect/>
+                    </a:stretch>
+                  </pic:blipFill>
+                  <pic:spPr bwMode="auto">
+                    <a:xfrm>
+                      <a:off x="0" y="0"/>
+                      <a:ext cx="5943600" cy="4201593"/>
+                    </a:xfrm>
+                    <a:prstGeom prst="rect">
+                      <a:avLst/>
+                    </a:prstGeom>
+                    <a:noFill/>
+                    <a:ln w="9525">
+                      <a:noFill/>
+                      <a:headEnd/>
+                      <a:tailEnd/>
+                    </a:ln>
+                  </pic:spPr>
+                </pic:pic>
+              </a:graphicData>
+            </a:graphic>
+          </wp:inline>
+        </w:drawing>
+      </w:r>
+    </w:p>
+    <w:bookmarkEnd w:id="151"/>
+    <w:bookmarkEnd w:id="152"/>
     <w:sectPr>
       <w:footerReference r:id="rId9" w:type="default"/>
       <w:pgSz w:code="1" w:h="15840" w:w="12240"/>
@@ -2968,6 +3158,9 @@
     <w:abstractNumId w:val="991"/>
   </w:num>
   <w:num w:numId="1022">
+    <w:abstractNumId w:val="991"/>
+  </w:num>
+  <w:num w:numId="1023">
     <w:abstractNumId w:val="991"/>
   </w:num>
 </w:numbering>
@@ -3167,11 +3360,11 @@
     <w:uiPriority w:val="9"/>
     <w:unhideWhenUsed/>
     <w:qFormat/>
-    <w:rsid w:val="00902FF0"/>
+    <w:rsid w:val="00F14C3E"/>
     <w:pPr>
       <w:keepNext/>
       <w:keepLines/>
-      <w:spacing w:after="0" w:before="200"/>
+      <w:spacing w:after="120" w:before="240"/>
       <w:outlineLvl w:val="1"/>
     </w:pPr>
     <w:rPr>
@@ -3179,13 +3372,14 @@
       <w:b/>
       <w:bCs/>
       <w:color w:themeColor="accent1" w:val="4F81BD"/>
-      <w:sz w:val="26"/>
-      <w:szCs w:val="26"/>
+      <w:sz w:val="36"/>
+      <w:szCs w:val="36"/>
     </w:rPr>
   </w:style>
   <w:style w:default="1" w:styleId="DefaultParagraphFont" w:type="character">
     <w:name w:val="Default Paragraph Font"/>
     <w:uiPriority w:val="1"/>
+    <w:semiHidden/>
     <w:unhideWhenUsed/>
   </w:style>
   <w:style w:default="1" w:styleId="TableNormal" w:type="table">
@@ -3350,14 +3544,14 @@
     <w:basedOn w:val="DefaultParagraphFont"/>
     <w:link w:val="Heading2"/>
     <w:uiPriority w:val="9"/>
-    <w:rsid w:val="00902FF0"/>
+    <w:rsid w:val="00F14C3E"/>
     <w:rPr>
       <w:rFonts w:cstheme="minorHAnsi" w:eastAsiaTheme="majorEastAsia"/>
       <w:b/>
       <w:bCs/>
       <w:color w:themeColor="accent1" w:val="4F81BD"/>
-      <w:sz w:val="26"/>
-      <w:szCs w:val="26"/>
+      <w:sz w:val="36"/>
+      <w:szCs w:val="36"/>
     </w:rPr>
   </w:style>
   <w:style w:styleId="ListParagraph" w:type="paragraph">

</xml_diff>